<commit_message>
fix: fetch client email for document request notifications
</commit_message>
<xml_diff>
--- a/CACP-credntials.docx
+++ b/CACP-credntials.docx
@@ -8,19 +8,33 @@
           <w:lang w:val="en-US"/>
         </w:rPr>
       </w:pPr>
-      <w:r>
-        <w:rPr>
-          <w:lang w:val="en-US"/>
-        </w:rPr>
-        <w:t>Project : CACP (CA CLIENT PORTAL)</w:t>
-      </w:r>
-    </w:p>
-    <w:p>
-      <w:pPr>
-        <w:rPr>
-          <w:lang w:val="en-US"/>
-        </w:rPr>
-      </w:pPr>
+      <w:proofErr w:type="gramStart"/>
+      <w:r>
+        <w:rPr>
+          <w:lang w:val="en-US"/>
+        </w:rPr>
+        <w:t>Project :</w:t>
+      </w:r>
+      <w:proofErr w:type="gramEnd"/>
+      <w:r>
+        <w:rPr>
+          <w:lang w:val="en-US"/>
+        </w:rPr>
+        <w:t xml:space="preserve"> CACP (CA CLIENT PORTAL)</w:t>
+      </w:r>
+    </w:p>
+    <w:p>
+      <w:pPr>
+        <w:rPr>
+          <w:lang w:val="en-US"/>
+        </w:rPr>
+      </w:pPr>
+      <w:r>
+        <w:rPr>
+          <w:lang w:val="en-US"/>
+        </w:rPr>
+        <w:t>=====================================</w:t>
+      </w:r>
     </w:p>
     <w:p>
       <w:pPr>
@@ -42,6 +56,43 @@
         </w:rPr>
         <w:t xml:space="preserve"> credentials –</w:t>
       </w:r>
+    </w:p>
+    <w:p>
+      <w:pPr>
+        <w:rPr>
+          <w:lang w:val="en-US"/>
+        </w:rPr>
+      </w:pPr>
+      <w:proofErr w:type="spellStart"/>
+      <w:proofErr w:type="gramStart"/>
+      <w:r>
+        <w:rPr>
+          <w:lang w:val="en-US"/>
+        </w:rPr>
+        <w:t>Organisations</w:t>
+      </w:r>
+      <w:proofErr w:type="spellEnd"/>
+      <w:r>
+        <w:rPr>
+          <w:lang w:val="en-US"/>
+        </w:rPr>
+        <w:t xml:space="preserve"> :first</w:t>
+      </w:r>
+      <w:proofErr w:type="gramEnd"/>
+      <w:r>
+        <w:rPr>
+          <w:lang w:val="en-US"/>
+        </w:rPr>
+        <w:t xml:space="preserve"> project </w:t>
+      </w:r>
+      <w:proofErr w:type="spellStart"/>
+      <w:r>
+        <w:rPr>
+          <w:lang w:val="en-US"/>
+        </w:rPr>
+        <w:t>supab</w:t>
+      </w:r>
+      <w:proofErr w:type="spellEnd"/>
     </w:p>
     <w:p>
       <w:pPr>
@@ -128,6 +179,7 @@
         <w:t xml:space="preserve"> Project </w:t>
       </w:r>
       <w:proofErr w:type="spellStart"/>
+      <w:proofErr w:type="gramStart"/>
       <w:r>
         <w:rPr>
           <w:lang w:val="en-US"/>
@@ -139,7 +191,14 @@
         <w:rPr>
           <w:lang w:val="en-US"/>
         </w:rPr>
-        <w:t xml:space="preserve"> : </w:t>
+        <w:t xml:space="preserve"> :</w:t>
+      </w:r>
+      <w:proofErr w:type="gramEnd"/>
+      <w:r>
+        <w:rPr>
+          <w:lang w:val="en-US"/>
+        </w:rPr>
+        <w:t xml:space="preserve"> </w:t>
       </w:r>
       <w:r>
         <w:rPr>
@@ -158,8 +217,16 @@
         <w:rPr>
           <w:lang w:val="en-US"/>
         </w:rPr>
-        <w:t>Project ID :</w:t>
-      </w:r>
+        <w:t xml:space="preserve">Project </w:t>
+      </w:r>
+      <w:proofErr w:type="gramStart"/>
+      <w:r>
+        <w:rPr>
+          <w:lang w:val="en-US"/>
+        </w:rPr>
+        <w:t>ID :</w:t>
+      </w:r>
+      <w:proofErr w:type="gramEnd"/>
       <w:r>
         <w:t xml:space="preserve"> </w:t>
       </w:r>
@@ -193,6 +260,7 @@
         <w:t xml:space="preserve"> project </w:t>
       </w:r>
       <w:proofErr w:type="spellStart"/>
+      <w:proofErr w:type="gramStart"/>
       <w:r>
         <w:rPr>
           <w:lang w:val="en-US"/>
@@ -206,6 +274,7 @@
         </w:rPr>
         <w:t xml:space="preserve"> :</w:t>
       </w:r>
+      <w:proofErr w:type="gramEnd"/>
       <w:r>
         <w:t xml:space="preserve"> </w:t>
       </w:r>
@@ -222,6 +291,250 @@
           <w:lang w:val="en-US"/>
         </w:rPr>
       </w:pPr>
+    </w:p>
+    <w:p>
+      <w:pPr>
+        <w:rPr>
+          <w:lang w:val="en-US"/>
+        </w:rPr>
+      </w:pPr>
+      <w:r>
+        <w:rPr>
+          <w:lang w:val="en-US"/>
+        </w:rPr>
+        <w:t>=========================================================</w:t>
+      </w:r>
+    </w:p>
+    <w:p>
+      <w:pPr>
+        <w:rPr>
+          <w:lang w:val="en-US"/>
+        </w:rPr>
+      </w:pPr>
+      <w:proofErr w:type="spellStart"/>
+      <w:r>
+        <w:rPr>
+          <w:lang w:val="en-US"/>
+        </w:rPr>
+        <w:t>Github</w:t>
+      </w:r>
+      <w:proofErr w:type="spellEnd"/>
+      <w:r>
+        <w:rPr>
+          <w:lang w:val="en-US"/>
+        </w:rPr>
+        <w:t>:</w:t>
+      </w:r>
+    </w:p>
+    <w:p>
+      <w:pPr>
+        <w:rPr>
+          <w:lang w:val="en-US"/>
+        </w:rPr>
+      </w:pPr>
+      <w:proofErr w:type="gramStart"/>
+      <w:r>
+        <w:rPr>
+          <w:lang w:val="en-US"/>
+        </w:rPr>
+        <w:t>Profile :</w:t>
+      </w:r>
+      <w:proofErr w:type="gramEnd"/>
+      <w:r>
+        <w:rPr>
+          <w:lang w:val="en-US"/>
+        </w:rPr>
+        <w:t xml:space="preserve"> kesariya5175</w:t>
+      </w:r>
+    </w:p>
+    <w:p>
+      <w:pPr>
+        <w:rPr>
+          <w:lang w:val="en-US"/>
+        </w:rPr>
+      </w:pPr>
+      <w:r>
+        <w:rPr>
+          <w:lang w:val="en-US"/>
+        </w:rPr>
+        <w:t>Repository:</w:t>
+      </w:r>
+      <w:r>
+        <w:rPr>
+          <w:rFonts w:ascii="Segoe UI" w:hAnsi="Segoe UI" w:cs="Segoe UI"/>
+          <w:color w:val="1F2328"/>
+          <w:sz w:val="21"/>
+          <w:szCs w:val="21"/>
+          <w:shd w:val="clear" w:color="auto" w:fill="FFFFFF"/>
+        </w:rPr>
+        <w:t xml:space="preserve"> </w:t>
+      </w:r>
+      <w:r>
+        <w:rPr>
+          <w:rFonts w:ascii="Segoe UI" w:hAnsi="Segoe UI" w:cs="Segoe UI"/>
+          <w:color w:val="1F2328"/>
+          <w:sz w:val="21"/>
+          <w:szCs w:val="21"/>
+          <w:shd w:val="clear" w:color="auto" w:fill="FFFFFF"/>
+        </w:rPr>
+        <w:t xml:space="preserve"> </w:t>
+      </w:r>
+      <w:hyperlink r:id="rId5" w:history="1">
+        <w:r>
+          <w:rPr>
+            <w:rStyle w:val="Hyperlink"/>
+            <w:b/>
+            <w:bCs/>
+          </w:rPr>
+          <w:t>ca-client-portal</w:t>
+        </w:r>
+      </w:hyperlink>
+      <w:r>
+        <w:rPr>
+          <w:lang w:val="en-US"/>
+        </w:rPr>
+        <w:t xml:space="preserve"> (public)</w:t>
+      </w:r>
+    </w:p>
+    <w:p>
+      <w:pPr>
+        <w:rPr>
+          <w:lang w:val="en-US"/>
+        </w:rPr>
+      </w:pPr>
+      <w:r>
+        <w:rPr>
+          <w:lang w:val="en-US"/>
+        </w:rPr>
+        <w:t>========================================================</w:t>
+      </w:r>
+    </w:p>
+    <w:p>
+      <w:pPr>
+        <w:rPr>
+          <w:lang w:val="en-US"/>
+        </w:rPr>
+      </w:pPr>
+      <w:r>
+        <w:rPr>
+          <w:lang w:val="en-US"/>
+        </w:rPr>
+        <w:t>Resend.com</w:t>
+      </w:r>
+    </w:p>
+    <w:p>
+      <w:pPr>
+        <w:rPr>
+          <w:lang w:val="en-US"/>
+        </w:rPr>
+      </w:pPr>
+      <w:r>
+        <w:rPr>
+          <w:lang w:val="en-US"/>
+        </w:rPr>
+        <w:t xml:space="preserve">Emails are sent via **Resend** (free tier: 100 emails/day) through a </w:t>
+      </w:r>
+      <w:proofErr w:type="spellStart"/>
+      <w:r>
+        <w:rPr>
+          <w:lang w:val="en-US"/>
+        </w:rPr>
+        <w:t>Supabase</w:t>
+      </w:r>
+      <w:proofErr w:type="spellEnd"/>
+      <w:r>
+        <w:rPr>
+          <w:lang w:val="en-US"/>
+        </w:rPr>
+        <w:t xml:space="preserve"> Edge Function.</w:t>
+      </w:r>
+      <w:r>
+        <w:rPr>
+          <w:lang w:val="en-US"/>
+        </w:rPr>
+        <w:br/>
+        <w:t xml:space="preserve">login with google, </w:t>
+      </w:r>
+      <w:proofErr w:type="spellStart"/>
+      <w:r>
+        <w:rPr>
+          <w:lang w:val="en-US"/>
+        </w:rPr>
+        <w:t>kesariya</w:t>
+      </w:r>
+      <w:proofErr w:type="spellEnd"/>
+      <w:r>
+        <w:rPr>
+          <w:lang w:val="en-US"/>
+        </w:rPr>
+        <w:t>.</w:t>
+      </w:r>
+    </w:p>
+    <w:p>
+      <w:pPr>
+        <w:rPr>
+          <w:lang w:val="en-US"/>
+        </w:rPr>
+      </w:pPr>
+      <w:proofErr w:type="spellStart"/>
+      <w:r>
+        <w:rPr>
+          <w:lang w:val="en-US"/>
+        </w:rPr>
+        <w:t>Api_key</w:t>
+      </w:r>
+      <w:proofErr w:type="spellEnd"/>
+      <w:r>
+        <w:rPr>
+          <w:lang w:val="en-US"/>
+        </w:rPr>
+        <w:t xml:space="preserve"> name: </w:t>
+      </w:r>
+      <w:proofErr w:type="spellStart"/>
+      <w:r>
+        <w:rPr>
+          <w:lang w:val="en-US"/>
+        </w:rPr>
+        <w:t>tosendemail</w:t>
+      </w:r>
+      <w:proofErr w:type="spellEnd"/>
+    </w:p>
+    <w:p>
+      <w:pPr>
+        <w:rPr>
+          <w:b/>
+          <w:bCs/>
+          <w:lang w:val="en-US"/>
+        </w:rPr>
+      </w:pPr>
+      <w:r>
+        <w:rPr>
+          <w:lang w:val="en-US"/>
+        </w:rPr>
+        <w:t xml:space="preserve">API </w:t>
+      </w:r>
+      <w:proofErr w:type="gramStart"/>
+      <w:r>
+        <w:rPr>
+          <w:lang w:val="en-US"/>
+        </w:rPr>
+        <w:t>Key :</w:t>
+      </w:r>
+      <w:proofErr w:type="gramEnd"/>
+      <w:r>
+        <w:rPr>
+          <w:lang w:val="en-US"/>
+        </w:rPr>
+        <w:t xml:space="preserve"> </w:t>
+      </w:r>
+      <w:r>
+        <w:rPr>
+          <w:b/>
+          <w:bCs/>
+          <w:lang w:val="en-US"/>
+        </w:rPr>
+        <w:t>re_AMxsqKh6_2ab1DPdWvujwx6bzav3swDSc</w:t>
+      </w:r>
     </w:p>
     <w:p>
       <w:pPr>
@@ -843,7 +1156,6 @@
   <w:style w:type="character" w:default="1" w:styleId="DefaultParagraphFont">
     <w:name w:val="Default Paragraph Font"/>
     <w:uiPriority w:val="1"/>
-    <w:semiHidden/>
     <w:unhideWhenUsed/>
   </w:style>
   <w:style w:type="table" w:default="1" w:styleId="TableNormal">

</xml_diff>

<commit_message>
fix: remove exposed API key, fetch client email for notifications
</commit_message>
<xml_diff>
--- a/CACP-credntials.docx
+++ b/CACP-credntials.docx
@@ -539,10 +539,294 @@
     <w:p>
       <w:pPr>
         <w:rPr>
-          <w:lang w:val="en-US"/>
-        </w:rPr>
-      </w:pPr>
-    </w:p>
+          <w:rFonts w:ascii="Nirmala UI" w:hAnsi="Nirmala UI" w:cs="Nirmala UI"/>
+          <w:b/>
+          <w:bCs/>
+        </w:rPr>
+      </w:pPr>
+      <w:proofErr w:type="spellStart"/>
+      <w:r>
+        <w:rPr>
+          <w:rFonts w:ascii="Nirmala UI" w:hAnsi="Nirmala UI" w:cs="Nirmala UI"/>
+          <w:b/>
+          <w:bCs/>
+        </w:rPr>
+        <w:t>श्रीं</w:t>
+      </w:r>
+      <w:proofErr w:type="spellEnd"/>
+      <w:r>
+        <w:rPr>
+          <w:b/>
+          <w:bCs/>
+        </w:rPr>
+        <w:t xml:space="preserve"> </w:t>
+      </w:r>
+      <w:proofErr w:type="spellStart"/>
+      <w:r>
+        <w:rPr>
+          <w:rFonts w:ascii="Nirmala UI" w:hAnsi="Nirmala UI" w:cs="Nirmala UI"/>
+          <w:b/>
+          <w:bCs/>
+        </w:rPr>
+        <w:t>ह्रीं</w:t>
+      </w:r>
+      <w:proofErr w:type="spellEnd"/>
+      <w:r>
+        <w:rPr>
+          <w:b/>
+          <w:bCs/>
+        </w:rPr>
+        <w:t xml:space="preserve"> </w:t>
+      </w:r>
+      <w:proofErr w:type="spellStart"/>
+      <w:r>
+        <w:rPr>
+          <w:rFonts w:ascii="Nirmala UI" w:hAnsi="Nirmala UI" w:cs="Nirmala UI"/>
+          <w:b/>
+          <w:bCs/>
+        </w:rPr>
+        <w:t>श्रीं</w:t>
+      </w:r>
+      <w:proofErr w:type="spellEnd"/>
+      <w:r>
+        <w:rPr>
+          <w:b/>
+          <w:bCs/>
+        </w:rPr>
+        <w:t xml:space="preserve"> </w:t>
+      </w:r>
+      <w:proofErr w:type="spellStart"/>
+      <w:r>
+        <w:rPr>
+          <w:rFonts w:ascii="Nirmala UI" w:hAnsi="Nirmala UI" w:cs="Nirmala UI"/>
+          <w:b/>
+          <w:bCs/>
+        </w:rPr>
+        <w:t>कमले</w:t>
+      </w:r>
+      <w:proofErr w:type="spellEnd"/>
+      <w:r>
+        <w:rPr>
+          <w:b/>
+          <w:bCs/>
+        </w:rPr>
+        <w:t xml:space="preserve"> </w:t>
+      </w:r>
+      <w:proofErr w:type="spellStart"/>
+      <w:r>
+        <w:rPr>
+          <w:rFonts w:ascii="Nirmala UI" w:hAnsi="Nirmala UI" w:cs="Nirmala UI"/>
+          <w:b/>
+          <w:bCs/>
+        </w:rPr>
+        <w:t>कमलालये</w:t>
+      </w:r>
+      <w:proofErr w:type="spellEnd"/>
+      <w:r>
+        <w:rPr>
+          <w:b/>
+          <w:bCs/>
+        </w:rPr>
+        <w:t xml:space="preserve"> </w:t>
+      </w:r>
+      <w:proofErr w:type="spellStart"/>
+      <w:r>
+        <w:rPr>
+          <w:rFonts w:ascii="Nirmala UI" w:hAnsi="Nirmala UI" w:cs="Nirmala UI"/>
+          <w:b/>
+          <w:bCs/>
+        </w:rPr>
+        <w:t>प्रसीद</w:t>
+      </w:r>
+      <w:proofErr w:type="spellEnd"/>
+      <w:r>
+        <w:rPr>
+          <w:b/>
+          <w:bCs/>
+        </w:rPr>
+        <w:t xml:space="preserve"> </w:t>
+      </w:r>
+      <w:proofErr w:type="spellStart"/>
+      <w:r>
+        <w:rPr>
+          <w:rFonts w:ascii="Nirmala UI" w:hAnsi="Nirmala UI" w:cs="Nirmala UI"/>
+          <w:b/>
+          <w:bCs/>
+        </w:rPr>
+        <w:t>प्रसीद</w:t>
+      </w:r>
+      <w:proofErr w:type="spellEnd"/>
+      <w:r>
+        <w:rPr>
+          <w:b/>
+          <w:bCs/>
+        </w:rPr>
+        <w:t xml:space="preserve"> </w:t>
+      </w:r>
+      <w:r>
+        <w:rPr>
+          <w:rFonts w:ascii="Nirmala UI" w:hAnsi="Nirmala UI" w:cs="Nirmala UI"/>
+          <w:b/>
+          <w:bCs/>
+        </w:rPr>
+        <w:t>ॐ</w:t>
+      </w:r>
+      <w:r>
+        <w:rPr>
+          <w:b/>
+          <w:bCs/>
+        </w:rPr>
+        <w:t xml:space="preserve"> </w:t>
+      </w:r>
+      <w:proofErr w:type="spellStart"/>
+      <w:r>
+        <w:rPr>
+          <w:rFonts w:ascii="Nirmala UI" w:hAnsi="Nirmala UI" w:cs="Nirmala UI"/>
+          <w:b/>
+          <w:bCs/>
+        </w:rPr>
+        <w:t>श्रीं</w:t>
+      </w:r>
+      <w:proofErr w:type="spellEnd"/>
+      <w:r>
+        <w:rPr>
+          <w:b/>
+          <w:bCs/>
+        </w:rPr>
+        <w:t xml:space="preserve"> </w:t>
+      </w:r>
+      <w:proofErr w:type="spellStart"/>
+      <w:r>
+        <w:rPr>
+          <w:rFonts w:ascii="Nirmala UI" w:hAnsi="Nirmala UI" w:cs="Nirmala UI"/>
+          <w:b/>
+          <w:bCs/>
+        </w:rPr>
+        <w:t>ह्रीं</w:t>
+      </w:r>
+      <w:proofErr w:type="spellEnd"/>
+      <w:r>
+        <w:rPr>
+          <w:b/>
+          <w:bCs/>
+        </w:rPr>
+        <w:t xml:space="preserve"> </w:t>
+      </w:r>
+      <w:proofErr w:type="spellStart"/>
+      <w:r>
+        <w:rPr>
+          <w:rFonts w:ascii="Nirmala UI" w:hAnsi="Nirmala UI" w:cs="Nirmala UI"/>
+          <w:b/>
+          <w:bCs/>
+        </w:rPr>
+        <w:t>श्रीं</w:t>
+      </w:r>
+      <w:proofErr w:type="spellEnd"/>
+      <w:r>
+        <w:rPr>
+          <w:b/>
+          <w:bCs/>
+        </w:rPr>
+        <w:t xml:space="preserve"> </w:t>
+      </w:r>
+      <w:proofErr w:type="spellStart"/>
+      <w:r>
+        <w:rPr>
+          <w:rFonts w:ascii="Nirmala UI" w:hAnsi="Nirmala UI" w:cs="Nirmala UI"/>
+          <w:b/>
+          <w:bCs/>
+        </w:rPr>
+        <w:t>महालक्ष्मयै</w:t>
+      </w:r>
+      <w:proofErr w:type="spellEnd"/>
+      <w:r>
+        <w:rPr>
+          <w:b/>
+          <w:bCs/>
+        </w:rPr>
+        <w:t xml:space="preserve"> </w:t>
+      </w:r>
+      <w:proofErr w:type="spellStart"/>
+      <w:r>
+        <w:rPr>
+          <w:rFonts w:ascii="Nirmala UI" w:hAnsi="Nirmala UI" w:cs="Nirmala UI"/>
+          <w:b/>
+          <w:bCs/>
+        </w:rPr>
+        <w:t>नम</w:t>
+      </w:r>
+      <w:proofErr w:type="spellEnd"/>
+    </w:p>
+    <w:p>
+      <w:pPr>
+        <w:rPr>
+          <w:b/>
+          <w:bCs/>
+        </w:rPr>
+      </w:pPr>
+      <w:proofErr w:type="spellStart"/>
+      <w:r>
+        <w:rPr>
+          <w:rFonts w:ascii="Nirmala UI" w:hAnsi="Nirmala UI" w:cs="Nirmala UI"/>
+          <w:b/>
+          <w:bCs/>
+        </w:rPr>
+        <w:t>लक्ष्मी</w:t>
+      </w:r>
+      <w:proofErr w:type="spellEnd"/>
+      <w:r>
+        <w:rPr>
+          <w:b/>
+          <w:bCs/>
+        </w:rPr>
+        <w:t xml:space="preserve"> </w:t>
+      </w:r>
+      <w:proofErr w:type="spellStart"/>
+      <w:r>
+        <w:rPr>
+          <w:rFonts w:ascii="Nirmala UI" w:hAnsi="Nirmala UI" w:cs="Nirmala UI"/>
+          <w:b/>
+          <w:bCs/>
+        </w:rPr>
+        <w:t>प्राप्ति</w:t>
+      </w:r>
+      <w:proofErr w:type="spellEnd"/>
+      <w:r>
+        <w:rPr>
+          <w:b/>
+          <w:bCs/>
+        </w:rPr>
+        <w:t xml:space="preserve"> </w:t>
+      </w:r>
+      <w:proofErr w:type="spellStart"/>
+      <w:r>
+        <w:rPr>
+          <w:rFonts w:ascii="Nirmala UI" w:hAnsi="Nirmala UI" w:cs="Nirmala UI"/>
+          <w:b/>
+          <w:bCs/>
+        </w:rPr>
+        <w:t>शाबर</w:t>
+      </w:r>
+      <w:proofErr w:type="spellEnd"/>
+      <w:r>
+        <w:rPr>
+          <w:b/>
+          <w:bCs/>
+        </w:rPr>
+        <w:t xml:space="preserve"> </w:t>
+      </w:r>
+      <w:proofErr w:type="spellStart"/>
+      <w:r>
+        <w:rPr>
+          <w:rFonts w:ascii="Nirmala UI" w:hAnsi="Nirmala UI" w:cs="Nirmala UI"/>
+          <w:b/>
+          <w:bCs/>
+        </w:rPr>
+        <w:t>मंत्र</w:t>
+      </w:r>
+      <w:proofErr w:type="spellEnd"/>
+    </w:p>
+    <w:p/>
     <w:sectPr>
       <w:pgSz w:w="11906" w:h="16838"/>
       <w:pgMar w:top="1440" w:right="1440" w:bottom="1440" w:left="1440" w:header="708" w:footer="708" w:gutter="0"/>
@@ -981,7 +1265,6 @@
     <w:next w:val="Normal"/>
     <w:link w:val="Heading2Char"/>
     <w:uiPriority w:val="9"/>
-    <w:semiHidden/>
     <w:unhideWhenUsed/>
     <w:qFormat/>
     <w:rsid w:val="005B71C8"/>
@@ -1197,7 +1480,6 @@
     <w:basedOn w:val="DefaultParagraphFont"/>
     <w:link w:val="Heading2"/>
     <w:uiPriority w:val="9"/>
-    <w:semiHidden/>
     <w:rsid w:val="005B71C8"/>
     <w:rPr>
       <w:rFonts w:asciiTheme="majorHAnsi" w:eastAsiaTheme="majorEastAsia" w:hAnsiTheme="majorHAnsi" w:cstheme="majorBidi"/>

</xml_diff>

<commit_message>
feat: super admin panel
</commit_message>
<xml_diff>
--- a/CACP-credntials.docx
+++ b/CACP-credntials.docx
@@ -291,6 +291,29 @@
           <w:lang w:val="en-US"/>
         </w:rPr>
       </w:pPr>
+      <w:proofErr w:type="spellStart"/>
+      <w:r>
+        <w:rPr>
+          <w:lang w:val="en-US"/>
+        </w:rPr>
+        <w:t>Supabase</w:t>
+      </w:r>
+      <w:proofErr w:type="spellEnd"/>
+      <w:r>
+        <w:rPr>
+          <w:lang w:val="en-US"/>
+        </w:rPr>
+        <w:t xml:space="preserve"> access token (exp. 14-8-26):</w:t>
+      </w:r>
+      <w:r>
+        <w:t xml:space="preserve"> </w:t>
+      </w:r>
+      <w:r>
+        <w:rPr>
+          <w:lang w:val="en-US"/>
+        </w:rPr>
+        <w:t>sbp_3dcd492e51a19fe44f68ac3fc4377395d12cec93</w:t>
+      </w:r>
     </w:p>
     <w:p>
       <w:pPr>
@@ -533,7 +556,7 @@
           <w:bCs/>
           <w:lang w:val="en-US"/>
         </w:rPr>
-        <w:t>re_AMxsqKh6_2ab1DPdWvujwx6bzav3swDSc</w:t>
+        <w:t>re_S7kgUNhb_9xTZ7VrvgyDeL9zv8x24JRZg</w:t>
       </w:r>
     </w:p>
     <w:p>
@@ -1439,6 +1462,7 @@
   <w:style w:type="character" w:default="1" w:styleId="DefaultParagraphFont">
     <w:name w:val="Default Paragraph Font"/>
     <w:uiPriority w:val="1"/>
+    <w:semiHidden/>
     <w:unhideWhenUsed/>
   </w:style>
   <w:style w:type="table" w:default="1" w:styleId="TableNormal">

</xml_diff>